<commit_message>
Website: the About page sets out the company
Below the scroll film the About page now shows who we are (registered name, business registration, the Nakuru workshop, timber from farms across Central Kenya), how we work in four steps, mission and vision, what we stand for, where to find us with a Google Maps link, and the founder with a round photo frame (public/brand/founder.jpg, the emblem until the photo is added). index.html carries the same facts as an Organization block for search engines and payment checks. Website User Interface and Development Timeline documents have 23 October rows.

Co-Authored-By: Claude Opus 5.5 <noreply@anthropic.com>
</commit_message>
<xml_diff>
--- a/documentation/01 System Overview/Development Timeline.docx
+++ b/documentation/01 System Overview/Development Timeline.docx
@@ -289,7 +289,7 @@
                 <w:sz w:val="20"/>
                 <w:szCs w:val="20"/>
               </w:rPr>
-              <w:t>21 October 2026</w:t>
+              <w:t>23 October 2026</w:t>
             </w:r>
           </w:p>
         </w:tc>
@@ -1671,6 +1671,74 @@
           </w:p>
         </w:tc>
       </w:tr>
+      <w:tr>
+        <w:tblPrEx>
+          <w:tblCellMar>
+            <w:top w:w="0" w:type="dxa"/>
+            <w:bottom w:w="0" w:type="dxa"/>
+          </w:tblCellMar>
+        </w:tblPrEx>
+        <w:tc>
+          <w:tcPr>
+            <w:tcW w:w="1300" w:type="dxa"/>
+            <w:tcMar>
+              <w:top w:w="50" w:type="dxa"/>
+              <w:left w:w="90" w:type="dxa"/>
+              <w:bottom w:w="50" w:type="dxa"/>
+              <w:right w:w="90" w:type="dxa"/>
+            </w:tcMar>
+          </w:tcPr>
+          <w:p>
+            <w:r>
+              <w:rPr>
+                <w:sz w:val="19"/>
+                <w:szCs w:val="19"/>
+              </w:rPr>
+              <w:t>1.1</w:t>
+            </w:r>
+          </w:p>
+        </w:tc>
+        <w:tc>
+          <w:tcPr>
+            <w:tcW w:w="1900" w:type="dxa"/>
+            <w:tcMar>
+              <w:top w:w="50" w:type="dxa"/>
+              <w:left w:w="90" w:type="dxa"/>
+              <w:bottom w:w="50" w:type="dxa"/>
+              <w:right w:w="90" w:type="dxa"/>
+            </w:tcMar>
+          </w:tcPr>
+          <w:p>
+            <w:r>
+              <w:rPr>
+                <w:sz w:val="19"/>
+                <w:szCs w:val="19"/>
+              </w:rPr>
+              <w:t>23 October 2026</w:t>
+            </w:r>
+          </w:p>
+        </w:tc>
+        <w:tc>
+          <w:tcPr>
+            <w:tcW w:w="6438" w:type="dxa"/>
+            <w:tcMar>
+              <w:top w:w="50" w:type="dxa"/>
+              <w:left w:w="90" w:type="dxa"/>
+              <w:bottom w:w="50" w:type="dxa"/>
+              <w:right w:w="90" w:type="dxa"/>
+            </w:tcMar>
+          </w:tcPr>
+          <w:p>
+            <w:r>
+              <w:rPr>
+                <w:sz w:val="19"/>
+                <w:szCs w:val="19"/>
+              </w:rPr>
+              <w:t>23 October: the About page sets out the company - who we are, how we work, where to find us and the founder.</w:t>
+            </w:r>
+          </w:p>
+        </w:tc>
+      </w:tr>
     </w:tbl>
     <w:p>
       <w:pPr>
@@ -1682,15 +1750,7 @@
           <w:sz w:val="20"/>
           <w:szCs w:val="20"/>
         </w:rPr>
-        <w:t>Keep this document u</w:t>
-      </w:r>
-      <w:r>
-        <w:rPr>
-          <w:color w:val="5F6B66"/>
-          <w:sz w:val="20"/>
-          <w:szCs w:val="20"/>
-        </w:rPr>
-        <w:t>p to date: when a feature, setting or server changes, edit the matching section here and add a line to the table above.</w:t>
+        <w:t>Keep this document up to date: when a feature, setting or server changes, edit the matching section here and add a line to the table above.</w:t>
       </w:r>
     </w:p>
     <w:p>
@@ -1711,7 +1771,7 @@
     <w:sdt>
       <w:sdtPr>
         <w:alias w:val="Contents"/>
-        <w:id w:val="1167067386"/>
+        <w:id w:val="-2045054340"/>
       </w:sdtPr>
       <w:sdtEndPr/>
       <w:sdtContent>
@@ -1738,7 +1798,7 @@
           <w:r>
             <w:fldChar w:fldCharType="separate"/>
           </w:r>
-          <w:hyperlink w:anchor="_Toc243481637" w:history="1">
+          <w:hyperlink w:anchor="_Toc243676161" w:history="1">
             <w:r>
               <w:rPr>
                 <w:rStyle w:val="Hyperlink"/>
@@ -1762,7 +1822,7 @@
               <w:rPr>
                 <w:noProof/>
               </w:rPr>
-              <w:instrText xml:space="preserve"> PAGEREF _Toc243481637 \h </w:instrText>
+              <w:instrText xml:space="preserve"> PAGEREF _Toc243676161 \h </w:instrText>
             </w:r>
             <w:r>
               <w:rPr>
@@ -1803,7 +1863,7 @@
               <w:szCs w:val="22"/>
             </w:rPr>
           </w:pPr>
-          <w:hyperlink w:anchor="_Toc243481638" w:history="1">
+          <w:hyperlink w:anchor="_Toc243676162" w:history="1">
             <w:r>
               <w:rPr>
                 <w:rStyle w:val="Hyperlink"/>
@@ -1827,7 +1887,7 @@
               <w:rPr>
                 <w:noProof/>
               </w:rPr>
-              <w:instrText xml:space="preserve"> PAGEREF _Toc243481638 \h </w:instrText>
+              <w:instrText xml:space="preserve"> PAGEREF _Toc243676162 \h </w:instrText>
             </w:r>
             <w:r>
               <w:rPr>
@@ -1868,7 +1928,7 @@
               <w:szCs w:val="22"/>
             </w:rPr>
           </w:pPr>
-          <w:hyperlink w:anchor="_Toc243481639" w:history="1">
+          <w:hyperlink w:anchor="_Toc243676163" w:history="1">
             <w:r>
               <w:rPr>
                 <w:rStyle w:val="Hyperlink"/>
@@ -1892,7 +1952,7 @@
               <w:rPr>
                 <w:noProof/>
               </w:rPr>
-              <w:instrText xml:space="preserve"> PAGEREF _Toc243481639 \h </w:instrText>
+              <w:instrText xml:space="preserve"> PAGEREF _Toc243676163 \h </w:instrText>
             </w:r>
             <w:r>
               <w:rPr>
@@ -1933,7 +1993,7 @@
               <w:szCs w:val="22"/>
             </w:rPr>
           </w:pPr>
-          <w:hyperlink w:anchor="_Toc243481640" w:history="1">
+          <w:hyperlink w:anchor="_Toc243676164" w:history="1">
             <w:r>
               <w:rPr>
                 <w:rStyle w:val="Hyperlink"/>
@@ -1957,7 +2017,7 @@
               <w:rPr>
                 <w:noProof/>
               </w:rPr>
-              <w:instrText xml:space="preserve"> PAGEREF _Toc243481640 \h </w:instrText>
+              <w:instrText xml:space="preserve"> PAGEREF _Toc243676164 \h </w:instrText>
             </w:r>
             <w:r>
               <w:rPr>
@@ -1998,7 +2058,7 @@
               <w:szCs w:val="22"/>
             </w:rPr>
           </w:pPr>
-          <w:hyperlink w:anchor="_Toc243481641" w:history="1">
+          <w:hyperlink w:anchor="_Toc243676165" w:history="1">
             <w:r>
               <w:rPr>
                 <w:rStyle w:val="Hyperlink"/>
@@ -2022,7 +2082,7 @@
               <w:rPr>
                 <w:noProof/>
               </w:rPr>
-              <w:instrText xml:space="preserve"> PAGEREF _Toc243481641 \h </w:instrText>
+              <w:instrText xml:space="preserve"> PAGEREF _Toc243676165 \h </w:instrText>
             </w:r>
             <w:r>
               <w:rPr>
@@ -2063,7 +2123,7 @@
               <w:szCs w:val="22"/>
             </w:rPr>
           </w:pPr>
-          <w:hyperlink w:anchor="_Toc243481642" w:history="1">
+          <w:hyperlink w:anchor="_Toc243676166" w:history="1">
             <w:r>
               <w:rPr>
                 <w:rStyle w:val="Hyperlink"/>
@@ -2087,7 +2147,7 @@
               <w:rPr>
                 <w:noProof/>
               </w:rPr>
-              <w:instrText xml:space="preserve"> PAGEREF _Toc243481642 \h </w:instrText>
+              <w:instrText xml:space="preserve"> PAGEREF _Toc243676166 \h </w:instrText>
             </w:r>
             <w:r>
               <w:rPr>
@@ -2128,7 +2188,7 @@
               <w:szCs w:val="22"/>
             </w:rPr>
           </w:pPr>
-          <w:hyperlink w:anchor="_Toc243481643" w:history="1">
+          <w:hyperlink w:anchor="_Toc243676167" w:history="1">
             <w:r>
               <w:rPr>
                 <w:rStyle w:val="Hyperlink"/>
@@ -2152,7 +2212,7 @@
               <w:rPr>
                 <w:noProof/>
               </w:rPr>
-              <w:instrText xml:space="preserve"> PAGEREF _Toc243481643 \h </w:instrText>
+              <w:instrText xml:space="preserve"> PAGEREF _Toc243676167 \h </w:instrText>
             </w:r>
             <w:r>
               <w:rPr>
@@ -2195,7 +2255,7 @@
       <w:pPr>
         <w:pStyle w:val="Heading1"/>
       </w:pPr>
-      <w:bookmarkStart w:id="1" w:name="_Toc243481637"/>
+      <w:bookmarkStart w:id="1" w:name="_Toc243676161"/>
       <w:r>
         <w:lastRenderedPageBreak/>
         <w:t>1  Introduction</w:t>
@@ -2222,7 +2282,7 @@
       <w:pPr>
         <w:pStyle w:val="Heading1"/>
       </w:pPr>
-      <w:bookmarkStart w:id="2" w:name="_Toc243481638"/>
+      <w:bookmarkStart w:id="2" w:name="_Toc243676162"/>
       <w:r>
         <w:lastRenderedPageBreak/>
         <w:t>2  Phases</w:t>
@@ -2422,14 +2482,7 @@
                 <w:sz w:val="19"/>
                 <w:szCs w:val="19"/>
               </w:rPr>
-              <w:t>Database design checked and created, profit functions, technology chos</w:t>
-            </w:r>
-            <w:r>
-              <w:rPr>
-                <w:sz w:val="19"/>
-                <w:szCs w:val="19"/>
-              </w:rPr>
-              <w:t>en, backend and servers scaffolded, first website, mobile app core sections</w:t>
+              <w:t>Database design checked and created, profit functions, technology chosen, backend and servers scaffolded, first website, mobile app core sections</w:t>
             </w:r>
           </w:p>
         </w:tc>
@@ -2514,7 +2567,14 @@
                 <w:sz w:val="19"/>
                 <w:szCs w:val="19"/>
               </w:rPr>
-              <w:t>Desktop app, trees and farmers, roles, M-Pesa Send Money (sandbox), AI insights and chat, voice input, servers panel</w:t>
+              <w:t>Desktop app, trees and farmers, roles, M-Pesa Send Money (sandbox), AI insights and chat, v</w:t>
+            </w:r>
+            <w:r>
+              <w:rPr>
+                <w:sz w:val="19"/>
+                <w:szCs w:val="19"/>
+              </w:rPr>
+              <w:t>oice input, servers panel</w:t>
             </w:r>
           </w:p>
         </w:tc>
@@ -3955,6 +4015,91 @@
                 <w:szCs w:val="19"/>
               </w:rPr>
               <w:t>A backdrop with depth, a floating menu that folds to icons, see-through cards and rain on glass in the Dark theme; the dashboard figures with a breakdown; the shared phone app and desktop copy rebuilt</w:t>
+            </w:r>
+          </w:p>
+        </w:tc>
+      </w:tr>
+      <w:tr>
+        <w:tblPrEx>
+          <w:tblCellMar>
+            <w:top w:w="0" w:type="dxa"/>
+            <w:bottom w:w="0" w:type="dxa"/>
+          </w:tblCellMar>
+        </w:tblPrEx>
+        <w:trPr>
+          <w:cantSplit/>
+        </w:trPr>
+        <w:tc>
+          <w:tcPr>
+            <w:tcW w:w="1830" w:type="dxa"/>
+            <w:shd w:val="clear" w:color="auto" w:fill="F4F5F3"/>
+            <w:tcMar>
+              <w:top w:w="50" w:type="dxa"/>
+              <w:left w:w="90" w:type="dxa"/>
+              <w:bottom w:w="50" w:type="dxa"/>
+              <w:right w:w="90" w:type="dxa"/>
+            </w:tcMar>
+          </w:tcPr>
+          <w:p>
+            <w:pPr>
+              <w:spacing w:after="20" w:line="252" w:lineRule="auto"/>
+            </w:pPr>
+            <w:r>
+              <w:rPr>
+                <w:b/>
+                <w:bCs/>
+                <w:sz w:val="19"/>
+                <w:szCs w:val="19"/>
+              </w:rPr>
+              <w:t>23 Oct</w:t>
+            </w:r>
+          </w:p>
+        </w:tc>
+        <w:tc>
+          <w:tcPr>
+            <w:tcW w:w="2196" w:type="dxa"/>
+            <w:shd w:val="clear" w:color="auto" w:fill="F4F5F3"/>
+            <w:tcMar>
+              <w:top w:w="50" w:type="dxa"/>
+              <w:left w:w="90" w:type="dxa"/>
+              <w:bottom w:w="50" w:type="dxa"/>
+              <w:right w:w="90" w:type="dxa"/>
+            </w:tcMar>
+          </w:tcPr>
+          <w:p>
+            <w:pPr>
+              <w:spacing w:after="20" w:line="252" w:lineRule="auto"/>
+            </w:pPr>
+            <w:r>
+              <w:rPr>
+                <w:sz w:val="19"/>
+                <w:szCs w:val="19"/>
+              </w:rPr>
+              <w:t>Who we are</w:t>
+            </w:r>
+          </w:p>
+        </w:tc>
+        <w:tc>
+          <w:tcPr>
+            <w:tcW w:w="5612" w:type="dxa"/>
+            <w:shd w:val="clear" w:color="auto" w:fill="F4F5F3"/>
+            <w:tcMar>
+              <w:top w:w="50" w:type="dxa"/>
+              <w:left w:w="90" w:type="dxa"/>
+              <w:bottom w:w="50" w:type="dxa"/>
+              <w:right w:w="90" w:type="dxa"/>
+            </w:tcMar>
+          </w:tcPr>
+          <w:p>
+            <w:pPr>
+              <w:spacing w:after="20" w:line="252" w:lineRule="auto"/>
+            </w:pPr>
+            <w:r>
+              <w:rPr>
+                <w:sz w:val="19"/>
+                <w:szCs w:val="19"/>
+              </w:rPr>
+              <w:t>The About page sets out the registered business, how we work (timber from farms across Central Kenya, milled in Nakuru), where to find us and the founder, ready for the move to the company domain</w:t>
             </w:r>
           </w:p>
         </w:tc>
@@ -3974,7 +4119,7 @@
       <w:pPr>
         <w:pStyle w:val="Heading1"/>
       </w:pPr>
-      <w:bookmarkStart w:id="3" w:name="_Toc243481639"/>
+      <w:bookmarkStart w:id="3" w:name="_Toc243676163"/>
       <w:r>
         <w:lastRenderedPageBreak/>
         <w:t>3  Timeline chart</w:t>
@@ -4064,7 +4209,7 @@
       <w:pPr>
         <w:pStyle w:val="Heading1"/>
       </w:pPr>
-      <w:bookmarkStart w:id="4" w:name="_Toc243481640"/>
+      <w:bookmarkStart w:id="4" w:name="_Toc243676164"/>
       <w:r>
         <w:lastRenderedPageBreak/>
         <w:t>4  Feature log</w:t>
@@ -12783,7 +12928,7 @@
       <w:pPr>
         <w:pStyle w:val="Heading1"/>
       </w:pPr>
-      <w:bookmarkStart w:id="5" w:name="_Toc243481641"/>
+      <w:bookmarkStart w:id="5" w:name="_Toc243676165"/>
       <w:r>
         <w:lastRenderedPageBreak/>
         <w:t>5  Database changes</w:t>
@@ -16940,7 +17085,7 @@
       <w:pPr>
         <w:pStyle w:val="Heading1"/>
       </w:pPr>
-      <w:bookmarkStart w:id="6" w:name="_Toc243481642"/>
+      <w:bookmarkStart w:id="6" w:name="_Toc243676166"/>
       <w:r>
         <w:lastRenderedPageBreak/>
         <w:t>6  Key decisions</w:t>
@@ -21263,7 +21408,7 @@
       <w:pPr>
         <w:pStyle w:val="Heading1"/>
       </w:pPr>
-      <w:bookmarkStart w:id="7" w:name="_Toc243481643"/>
+      <w:bookmarkStart w:id="7" w:name="_Toc243676167"/>
       <w:r>
         <w:lastRenderedPageBreak/>
         <w:t>7  Open items at the time of writing</w:t>
@@ -21632,134 +21777,10 @@
 <file path=word/numbering.xml><?xml version="1.0" encoding="utf-8"?>
 <w:numbering xmlns:wpc="http://schemas.microsoft.com/office/word/2010/wordprocessingCanvas" xmlns:cx="http://schemas.microsoft.com/office/drawing/2014/chartex" xmlns:cx1="http://schemas.microsoft.com/office/drawing/2015/9/8/chartex" xmlns:mc="http://schemas.openxmlformats.org/markup-compatibility/2006" xmlns:o="urn:schemas-microsoft-com:office:office" xmlns:r="http://schemas.openxmlformats.org/officeDocument/2006/relationships" xmlns:m="http://schemas.openxmlformats.org/officeDocument/2006/math" xmlns:v="urn:schemas-microsoft-com:vml" xmlns:wp14="http://schemas.microsoft.com/office/word/2010/wordprocessingDrawing" xmlns:wp="http://schemas.openxmlformats.org/drawingml/2006/wordprocessingDrawing" xmlns:w10="urn:schemas-microsoft-com:office:word" xmlns:w="http://schemas.openxmlformats.org/wordprocessingml/2006/main" xmlns:w14="http://schemas.microsoft.com/office/word/2010/wordml" xmlns:w15="http://schemas.microsoft.com/office/word/2012/wordml" xmlns:w16se="http://schemas.microsoft.com/office/word/2015/wordml/symex" xmlns:wpg="http://schemas.microsoft.com/office/word/2010/wordprocessingGroup" xmlns:wpi="http://schemas.microsoft.com/office/word/2010/wordprocessingInk" xmlns:wne="http://schemas.microsoft.com/office/word/2006/wordml" xmlns:wps="http://schemas.microsoft.com/office/word/2010/wordprocessingShape" mc:Ignorable="w14 w15 w16se wp14">
   <w:abstractNum w:abstractNumId="0" w15:restartNumberingAfterBreak="0">
-    <w:nsid w:val="0FF54F27"/>
+    <w:nsid w:val="2F5A533F"/>
     <w:multiLevelType w:val="hybridMultilevel"/>
-    <w:tmpl w:val="B066E562"/>
-    <w:lvl w:ilvl="0" w:tplc="A418DB42" w:tentative="1">
-      <w:start w:val="1"/>
-      <w:numFmt w:val="decimal"/>
-      <w:lvlText w:val="%1."/>
-      <w:lvlJc w:val="left"/>
-      <w:pPr>
-        <w:ind w:left="540" w:hanging="300"/>
-      </w:pPr>
-    </w:lvl>
-    <w:lvl w:ilvl="1" w:tplc="231ADFE4" w:tentative="1">
-      <w:start w:val="1"/>
-      <w:numFmt w:val="lowerLetter"/>
-      <w:lvlText w:val="%2."/>
-      <w:lvlJc w:val="left"/>
-      <w:pPr>
-        <w:ind w:left="940" w:hanging="300"/>
-      </w:pPr>
-    </w:lvl>
-    <w:lvl w:ilvl="2" w:tplc="F3220032" w:tentative="1">
-      <w:start w:val="1"/>
-      <w:numFmt w:val="lowerRoman"/>
-      <w:lvlText w:val="%3."/>
-      <w:lvlJc w:val="left"/>
-      <w:pPr>
-        <w:ind w:left="1340" w:hanging="300"/>
-      </w:pPr>
-    </w:lvl>
-    <w:lvl w:ilvl="3" w:tplc="CE94998A">
-      <w:numFmt w:val="decimal"/>
-      <w:lvlText w:val=""/>
-      <w:lvlJc w:val="left"/>
-    </w:lvl>
-    <w:lvl w:ilvl="4" w:tplc="DD9A05B6">
-      <w:numFmt w:val="decimal"/>
-      <w:lvlText w:val=""/>
-      <w:lvlJc w:val="left"/>
-    </w:lvl>
-    <w:lvl w:ilvl="5" w:tplc="5A62BEC0">
-      <w:numFmt w:val="decimal"/>
-      <w:lvlText w:val=""/>
-      <w:lvlJc w:val="left"/>
-    </w:lvl>
-    <w:lvl w:ilvl="6" w:tplc="4960533A">
-      <w:numFmt w:val="decimal"/>
-      <w:lvlText w:val=""/>
-      <w:lvlJc w:val="left"/>
-    </w:lvl>
-    <w:lvl w:ilvl="7" w:tplc="4BC2C844">
-      <w:numFmt w:val="decimal"/>
-      <w:lvlText w:val=""/>
-      <w:lvlJc w:val="left"/>
-    </w:lvl>
-    <w:lvl w:ilvl="8" w:tplc="95F0A144">
-      <w:numFmt w:val="decimal"/>
-      <w:lvlText w:val=""/>
-      <w:lvlJc w:val="left"/>
-    </w:lvl>
-  </w:abstractNum>
-  <w:abstractNum w:abstractNumId="1" w15:restartNumberingAfterBreak="0">
-    <w:nsid w:val="3E9F102D"/>
-    <w:multiLevelType w:val="hybridMultilevel"/>
-    <w:tmpl w:val="8494C9D4"/>
-    <w:lvl w:ilvl="0" w:tplc="86E8EA82">
-      <w:start w:val="1"/>
-      <w:numFmt w:val="bullet"/>
-      <w:lvlText w:val="•"/>
-      <w:lvlJc w:val="left"/>
-      <w:pPr>
-        <w:ind w:left="540" w:hanging="300"/>
-      </w:pPr>
-    </w:lvl>
-    <w:lvl w:ilvl="1" w:tplc="0234C5AA" w:tentative="1">
-      <w:start w:val="1"/>
-      <w:numFmt w:val="bullet"/>
-      <w:lvlText w:val="–"/>
-      <w:lvlJc w:val="left"/>
-      <w:pPr>
-        <w:ind w:left="940" w:hanging="300"/>
-      </w:pPr>
-    </w:lvl>
-    <w:lvl w:ilvl="2" w:tplc="8B9A139A" w:tentative="1">
-      <w:start w:val="1"/>
-      <w:numFmt w:val="bullet"/>
-      <w:lvlText w:val="◦"/>
-      <w:lvlJc w:val="left"/>
-      <w:pPr>
-        <w:ind w:left="1340" w:hanging="300"/>
-      </w:pPr>
-    </w:lvl>
-    <w:lvl w:ilvl="3" w:tplc="6B38A040">
-      <w:numFmt w:val="decimal"/>
-      <w:lvlText w:val=""/>
-      <w:lvlJc w:val="left"/>
-    </w:lvl>
-    <w:lvl w:ilvl="4" w:tplc="5ECAFB06">
-      <w:numFmt w:val="decimal"/>
-      <w:lvlText w:val=""/>
-      <w:lvlJc w:val="left"/>
-    </w:lvl>
-    <w:lvl w:ilvl="5" w:tplc="B66AA57E">
-      <w:numFmt w:val="decimal"/>
-      <w:lvlText w:val=""/>
-      <w:lvlJc w:val="left"/>
-    </w:lvl>
-    <w:lvl w:ilvl="6" w:tplc="7F64C076">
-      <w:numFmt w:val="decimal"/>
-      <w:lvlText w:val=""/>
-      <w:lvlJc w:val="left"/>
-    </w:lvl>
-    <w:lvl w:ilvl="7" w:tplc="F03CB334">
-      <w:numFmt w:val="decimal"/>
-      <w:lvlText w:val=""/>
-      <w:lvlJc w:val="left"/>
-    </w:lvl>
-    <w:lvl w:ilvl="8" w:tplc="786057D6">
-      <w:numFmt w:val="decimal"/>
-      <w:lvlText w:val=""/>
-      <w:lvlJc w:val="left"/>
-    </w:lvl>
-  </w:abstractNum>
-  <w:abstractNum w:abstractNumId="2" w15:restartNumberingAfterBreak="0">
-    <w:nsid w:val="5D8165FA"/>
-    <w:multiLevelType w:val="hybridMultilevel"/>
-    <w:tmpl w:val="0D2EE5C4"/>
-    <w:lvl w:ilvl="0" w:tplc="4AF4E576" w:tentative="1">
+    <w:tmpl w:val="9EAA7CB8"/>
+    <w:lvl w:ilvl="0" w:tplc="37D43430" w:tentative="1">
       <w:start w:val="1"/>
       <w:numFmt w:val="bullet"/>
       <w:lvlText w:val="●"/>
@@ -21768,7 +21789,7 @@
         <w:ind w:left="720" w:hanging="360"/>
       </w:pPr>
     </w:lvl>
-    <w:lvl w:ilvl="1" w:tplc="983A7ED6" w:tentative="1">
+    <w:lvl w:ilvl="1" w:tplc="621404EA" w:tentative="1">
       <w:start w:val="1"/>
       <w:numFmt w:val="bullet"/>
       <w:lvlText w:val="○"/>
@@ -21777,7 +21798,7 @@
         <w:ind w:left="1440" w:hanging="360"/>
       </w:pPr>
     </w:lvl>
-    <w:lvl w:ilvl="2" w:tplc="394EB42C" w:tentative="1">
+    <w:lvl w:ilvl="2" w:tplc="EDDE2384" w:tentative="1">
       <w:start w:val="1"/>
       <w:numFmt w:val="bullet"/>
       <w:lvlText w:val="■"/>
@@ -21786,7 +21807,7 @@
         <w:ind w:left="2160" w:hanging="360"/>
       </w:pPr>
     </w:lvl>
-    <w:lvl w:ilvl="3" w:tplc="A2D07B04" w:tentative="1">
+    <w:lvl w:ilvl="3" w:tplc="0876DB3A" w:tentative="1">
       <w:start w:val="1"/>
       <w:numFmt w:val="bullet"/>
       <w:lvlText w:val="●"/>
@@ -21795,7 +21816,7 @@
         <w:ind w:left="2880" w:hanging="360"/>
       </w:pPr>
     </w:lvl>
-    <w:lvl w:ilvl="4" w:tplc="B26EC39C" w:tentative="1">
+    <w:lvl w:ilvl="4" w:tplc="DB2018EC" w:tentative="1">
       <w:start w:val="1"/>
       <w:numFmt w:val="bullet"/>
       <w:lvlText w:val="○"/>
@@ -21804,7 +21825,7 @@
         <w:ind w:left="3600" w:hanging="360"/>
       </w:pPr>
     </w:lvl>
-    <w:lvl w:ilvl="5" w:tplc="D1765A64" w:tentative="1">
+    <w:lvl w:ilvl="5" w:tplc="84704460" w:tentative="1">
       <w:start w:val="1"/>
       <w:numFmt w:val="bullet"/>
       <w:lvlText w:val="■"/>
@@ -21813,7 +21834,7 @@
         <w:ind w:left="4320" w:hanging="360"/>
       </w:pPr>
     </w:lvl>
-    <w:lvl w:ilvl="6" w:tplc="41EC64F6" w:tentative="1">
+    <w:lvl w:ilvl="6" w:tplc="6ED6A9C8" w:tentative="1">
       <w:start w:val="1"/>
       <w:numFmt w:val="bullet"/>
       <w:lvlText w:val="●"/>
@@ -21822,7 +21843,7 @@
         <w:ind w:left="5040" w:hanging="360"/>
       </w:pPr>
     </w:lvl>
-    <w:lvl w:ilvl="7" w:tplc="93E8AFD0" w:tentative="1">
+    <w:lvl w:ilvl="7" w:tplc="DE3E96B2" w:tentative="1">
       <w:start w:val="1"/>
       <w:numFmt w:val="bullet"/>
       <w:lvlText w:val="●"/>
@@ -21831,7 +21852,7 @@
         <w:ind w:left="5760" w:hanging="360"/>
       </w:pPr>
     </w:lvl>
-    <w:lvl w:ilvl="8" w:tplc="557C05BC" w:tentative="1">
+    <w:lvl w:ilvl="8" w:tplc="D02E10CA" w:tentative="1">
       <w:start w:val="1"/>
       <w:numFmt w:val="bullet"/>
       <w:lvlText w:val="●"/>
@@ -21841,8 +21862,132 @@
       </w:pPr>
     </w:lvl>
   </w:abstractNum>
+  <w:abstractNum w:abstractNumId="1" w15:restartNumberingAfterBreak="0">
+    <w:nsid w:val="351226CE"/>
+    <w:multiLevelType w:val="hybridMultilevel"/>
+    <w:tmpl w:val="DA021E26"/>
+    <w:lvl w:ilvl="0" w:tplc="0E0C4A88">
+      <w:start w:val="1"/>
+      <w:numFmt w:val="bullet"/>
+      <w:lvlText w:val="•"/>
+      <w:lvlJc w:val="left"/>
+      <w:pPr>
+        <w:ind w:left="540" w:hanging="300"/>
+      </w:pPr>
+    </w:lvl>
+    <w:lvl w:ilvl="1" w:tplc="A4D86A76" w:tentative="1">
+      <w:start w:val="1"/>
+      <w:numFmt w:val="bullet"/>
+      <w:lvlText w:val="–"/>
+      <w:lvlJc w:val="left"/>
+      <w:pPr>
+        <w:ind w:left="940" w:hanging="300"/>
+      </w:pPr>
+    </w:lvl>
+    <w:lvl w:ilvl="2" w:tplc="C982146E" w:tentative="1">
+      <w:start w:val="1"/>
+      <w:numFmt w:val="bullet"/>
+      <w:lvlText w:val="◦"/>
+      <w:lvlJc w:val="left"/>
+      <w:pPr>
+        <w:ind w:left="1340" w:hanging="300"/>
+      </w:pPr>
+    </w:lvl>
+    <w:lvl w:ilvl="3" w:tplc="1DBAD6D2">
+      <w:numFmt w:val="decimal"/>
+      <w:lvlText w:val=""/>
+      <w:lvlJc w:val="left"/>
+    </w:lvl>
+    <w:lvl w:ilvl="4" w:tplc="CA18892A">
+      <w:numFmt w:val="decimal"/>
+      <w:lvlText w:val=""/>
+      <w:lvlJc w:val="left"/>
+    </w:lvl>
+    <w:lvl w:ilvl="5" w:tplc="6FA0D9DE">
+      <w:numFmt w:val="decimal"/>
+      <w:lvlText w:val=""/>
+      <w:lvlJc w:val="left"/>
+    </w:lvl>
+    <w:lvl w:ilvl="6" w:tplc="C91254DE">
+      <w:numFmt w:val="decimal"/>
+      <w:lvlText w:val=""/>
+      <w:lvlJc w:val="left"/>
+    </w:lvl>
+    <w:lvl w:ilvl="7" w:tplc="3342BC58">
+      <w:numFmt w:val="decimal"/>
+      <w:lvlText w:val=""/>
+      <w:lvlJc w:val="left"/>
+    </w:lvl>
+    <w:lvl w:ilvl="8" w:tplc="353E1CCA">
+      <w:numFmt w:val="decimal"/>
+      <w:lvlText w:val=""/>
+      <w:lvlJc w:val="left"/>
+    </w:lvl>
+  </w:abstractNum>
+  <w:abstractNum w:abstractNumId="2" w15:restartNumberingAfterBreak="0">
+    <w:nsid w:val="792A0CC8"/>
+    <w:multiLevelType w:val="hybridMultilevel"/>
+    <w:tmpl w:val="2A5A3D6C"/>
+    <w:lvl w:ilvl="0" w:tplc="B35077CE" w:tentative="1">
+      <w:start w:val="1"/>
+      <w:numFmt w:val="decimal"/>
+      <w:lvlText w:val="%1."/>
+      <w:lvlJc w:val="left"/>
+      <w:pPr>
+        <w:ind w:left="540" w:hanging="300"/>
+      </w:pPr>
+    </w:lvl>
+    <w:lvl w:ilvl="1" w:tplc="A394FB00" w:tentative="1">
+      <w:start w:val="1"/>
+      <w:numFmt w:val="lowerLetter"/>
+      <w:lvlText w:val="%2."/>
+      <w:lvlJc w:val="left"/>
+      <w:pPr>
+        <w:ind w:left="940" w:hanging="300"/>
+      </w:pPr>
+    </w:lvl>
+    <w:lvl w:ilvl="2" w:tplc="E714A222" w:tentative="1">
+      <w:start w:val="1"/>
+      <w:numFmt w:val="lowerRoman"/>
+      <w:lvlText w:val="%3."/>
+      <w:lvlJc w:val="left"/>
+      <w:pPr>
+        <w:ind w:left="1340" w:hanging="300"/>
+      </w:pPr>
+    </w:lvl>
+    <w:lvl w:ilvl="3" w:tplc="6696DFD2">
+      <w:numFmt w:val="decimal"/>
+      <w:lvlText w:val=""/>
+      <w:lvlJc w:val="left"/>
+    </w:lvl>
+    <w:lvl w:ilvl="4" w:tplc="265AA336">
+      <w:numFmt w:val="decimal"/>
+      <w:lvlText w:val=""/>
+      <w:lvlJc w:val="left"/>
+    </w:lvl>
+    <w:lvl w:ilvl="5" w:tplc="E1C6FFB2">
+      <w:numFmt w:val="decimal"/>
+      <w:lvlText w:val=""/>
+      <w:lvlJc w:val="left"/>
+    </w:lvl>
+    <w:lvl w:ilvl="6" w:tplc="F788DDA6">
+      <w:numFmt w:val="decimal"/>
+      <w:lvlText w:val=""/>
+      <w:lvlJc w:val="left"/>
+    </w:lvl>
+    <w:lvl w:ilvl="7" w:tplc="D57C9DB4">
+      <w:numFmt w:val="decimal"/>
+      <w:lvlText w:val=""/>
+      <w:lvlJc w:val="left"/>
+    </w:lvl>
+    <w:lvl w:ilvl="8" w:tplc="A13C1D6C">
+      <w:numFmt w:val="decimal"/>
+      <w:lvlText w:val=""/>
+      <w:lvlJc w:val="left"/>
+    </w:lvl>
+  </w:abstractNum>
   <w:num w:numId="1">
-    <w:abstractNumId w:val="2"/>
+    <w:abstractNumId w:val="0"/>
     <w:lvlOverride w:ilvl="0">
       <w:startOverride w:val="1"/>
     </w:lvlOverride>
@@ -22477,7 +22622,7 @@
     <w:autoRedefine/>
     <w:uiPriority w:val="39"/>
     <w:unhideWhenUsed/>
-    <w:rsid w:val="00C61FE4"/>
+    <w:rsid w:val="007417C6"/>
     <w:pPr>
       <w:spacing w:after="100"/>
     </w:pPr>

</xml_diff>